<commit_message>
Align Word proposal templates with current sunholo.com brand tokens
The template's action orange, muted-grey and rule colors had drifted from
the site's tokens (#B52D10/#6A7884/#DCE2E7 instead of the current
#BD3012/#526677/#DCE3E8, unified on the site 12-13 Sep). Body text and the
table style were also set in Arial rather than Montserrat, contradicting
the template's own README, and Heading1/2/3 sizes sat below the brand
guide's documented Document ranges (25/13.5/11.5pt vs 28-32/18-22/14-16pt) -
now 30/20/15pt.

Also adds the "AI engineering" service-study illustration from the shared
brand illustration kit to the proposal cover page. Rebuilt all three brand
variants (Sunholo/Holosun/AILANG) and their reference docs; verified by
rendering each to PDF.

Co-Authored-By: Claude Sonnet 5 <noreply@anthropic.com>
Claude-Session: https://claude.ai/code/session_01HCCjSt2twTKTxuboow1az1
</commit_message>
<xml_diff>
--- a/docs/templates/output/ailang-proposal.docx
+++ b/docs/templates/output/ailang-proposal.docx
@@ -72,6 +72,41 @@
       </w:r>
       <w:r>
         <w:t xml:space="preserve"> «DD Month YYYY»</w:t>
+      </w:r>
+    </w:p>
+    <w:p>
+      <w:r>
+        <w:drawing>
+          <wp:inline distT="0" distB="0" distL="0" distR="0">
+            <wp:extent cx="5486400" cy="3657600"/>
+            <wp:docPr id="1" name="Image 1" descr="Architectural illustration of AI engineering: connected structural forms in slate linework with an orange ink wash"/>
+            <a:graphic>
+              <a:graphicData uri="http://schemas.openxmlformats.org/drawingml/2006/picture">
+                <pic:pic>
+                  <pic:nvPicPr>
+                    <pic:cNvPr id="1" name="Image 1"/>
+                    <pic:cNvPicPr/>
+                  </pic:nvPicPr>
+                  <pic:blipFill>
+                    <a:blip r:embed="rIdImage1"/>
+                    <a:stretch>
+                      <a:fillRect/>
+                    </a:stretch>
+                  </pic:blipFill>
+                  <pic:spPr>
+                    <a:xfrm>
+                      <a:off x="0" y="0"/>
+                      <a:ext cx="5486400" cy="3657600"/>
+                    </a:xfrm>
+                    <a:prstGeom prst="rect">
+                      <a:avLst/>
+                    </a:prstGeom>
+                  </pic:spPr>
+                </pic:pic>
+              </a:graphicData>
+            </a:graphic>
+          </wp:inline>
+        </w:drawing>
       </w:r>
     </w:p>
     <w:p>
@@ -1088,7 +1123,7 @@
   <w:p>
     <w:pPr>
       <w:pBdr>
-        <w:top w:val="single" w:sz="4" w:space="10" w:color="DCE2E7"/>
+        <w:top w:val="single" w:sz="4" w:space="10" w:color="DCE3E8"/>
       </w:pBdr>
       <w:tabs>
         <w:tab w:val="right" w:pos="9298"/>
@@ -1098,7 +1133,7 @@
     <w:r>
       <w:rPr>
         <w:sz w:val="16"/>
-        <w:color w:val="6A7884"/>
+        <w:color w:val="526677"/>
       </w:rPr>
       <w:t>Holosun ApS · CVR 44324687 · ailang.sunholo.com</w:t>
       <w:tab/>
@@ -1107,7 +1142,7 @@
       <w:r>
         <w:rPr>
           <w:sz w:val="16"/>
-          <w:color w:val="6A7884"/>
+          <w:color w:val="526677"/>
         </w:rPr>
         <w:t>1</w:t>
       </w:r>
@@ -1171,7 +1206,7 @@
     <w:r>
       <w:rPr>
         <w:sz w:val="17"/>
-        <w:color w:val="6A7884"/>
+        <w:color w:val="526677"/>
         <w:position w:val="30"/>
       </w:rPr>
       <w:tab/>
@@ -1186,7 +1221,7 @@
     <w:r>
       <w:rPr>
         <w:sz w:val="17"/>
-        <w:color w:val="6A7884"/>
+        <w:color w:val="526677"/>
       </w:rPr>
       <w:t>Trustworthy AI code</w:t>
     </w:r>
@@ -1249,7 +1284,7 @@
     <w:r>
       <w:rPr>
         <w:sz w:val="17"/>
-        <w:color w:val="6A7884"/>
+        <w:color w:val="526677"/>
         <w:position w:val="14"/>
       </w:rPr>
       <w:tab/>
@@ -1264,7 +1299,7 @@
     <w:r>
       <w:rPr>
         <w:sz w:val="17"/>
-        <w:color w:val="6A7884"/>
+        <w:color w:val="526677"/>
       </w:rPr>
       <w:t>Trustworthy AI code</w:t>
     </w:r>
@@ -1315,7 +1350,7 @@
   <w:docDefaults>
     <w:rPrDefault>
       <w:rPr>
-        <w:rFonts w:ascii="Arial" w:hAnsi="Arial" w:cs="Arial"/>
+        <w:rFonts w:ascii="Montserrat" w:hAnsi="Montserrat" w:cs="Montserrat"/>
         <w:color w:val="314352"/>
         <w:sz w:val="22"/>
         <w:lang w:val="en-GB"/>
@@ -1351,7 +1386,7 @@
       <w:rFonts w:ascii="Montserrat" w:hAnsi="Montserrat"/>
       <w:b/>
       <w:color w:val="314352"/>
-      <w:sz w:val="50"/>
+      <w:sz w:val="60"/>
     </w:rPr>
   </w:style>
   <w:style w:type="paragraph" w:styleId="Heading2">
@@ -1369,7 +1404,7 @@
       <w:rFonts w:ascii="Montserrat" w:hAnsi="Montserrat"/>
       <w:b/>
       <w:color w:val="314352"/>
-      <w:sz w:val="27"/>
+      <w:sz w:val="40"/>
     </w:rPr>
   </w:style>
   <w:style w:type="paragraph" w:styleId="Heading3">
@@ -1386,8 +1421,8 @@
     <w:rPr>
       <w:rFonts w:ascii="Montserrat" w:hAnsi="Montserrat"/>
       <w:b/>
-      <w:color w:val="B52D10"/>
-      <w:sz w:val="23"/>
+      <w:color w:val="BD3012"/>
+      <w:sz w:val="30"/>
     </w:rPr>
   </w:style>
   <w:style w:type="paragraph" w:styleId="ListParagraph">
@@ -1401,7 +1436,7 @@
   <w:style w:type="character" w:styleId="Hyperlink">
     <w:name w:val="Hyperlink"/>
     <w:rPr>
-      <w:color w:val="B52D10"/>
+      <w:color w:val="BD3012"/>
       <w:u w:val="single"/>
     </w:rPr>
   </w:style>
@@ -1411,15 +1446,15 @@
       <w:spacing w:before="0" w:after="60" w:line="260" w:lineRule="auto"/>
     </w:pPr>
     <w:rPr>
-      <w:rFonts w:ascii="Arial" w:hAnsi="Arial" w:cs="Arial"/>
+      <w:rFonts w:ascii="Montserrat" w:hAnsi="Montserrat" w:cs="Montserrat"/>
       <w:sz w:val="20"/>
       <w:color w:val="314352"/>
     </w:rPr>
     <w:tblPr>
       <w:tblBorders>
         <w:top w:val="single" w:sz="8" w:color="E73C17"/>
-        <w:bottom w:val="single" w:sz="4" w:color="DCE2E7"/>
-        <w:insideH w:val="single" w:sz="4" w:color="DCE2E7"/>
+        <w:bottom w:val="single" w:sz="4" w:color="DCE3E8"/>
+        <w:insideH w:val="single" w:sz="4" w:color="DCE3E8"/>
       </w:tblBorders>
       <w:tblCellMar>
         <w:top w:w="130" w:type="dxa"/>

</xml_diff>